<commit_message>
First version of Proj
</commit_message>
<xml_diff>
--- a/research/PathOmicDRP_Full_Manuscript_v7.docx
+++ b/research/PathOmicDRP_Full_Manuscript_v7.docx
@@ -40,7 +40,7 @@
     <w:p>
       <w:pPr/>
       <w:r>
-        <w:t>Bootstrap 95% CIs on the clinical AUCs are reported to quantify uncertainty under small outcome-imbalanced subsets. Drug-level analysis revealed a mechanistically coherent split: PathOmicDRP's learned fusion substantially outperformed a fair PCA-256 baseline on DNA-damaging agents (doxorubicin ΔAUC = +0.56, cyclophosphamide ΔAUC = +0.57), whereas the simpler linear baseline matched or exceeded PathOmicDRP on microtubule-targeting taxanes (Δ = −0.39 and −0.48), defining cross-modal multi-factorial response as the regime in which fusion is most valuable.</w:t>
+        <w:t>Cross-attention fusion also provided superior robustness to missing modalities compared to self-attention alternatives (55.6% vs. 43.0% performance retention with three modalities missing). In an independent METABRIC cohort (n = 1,980), predicted Tamoxifen and Fulvestrant IC₅₀ values were markedly lower in ER-positive tumors (Mann–Whitney p ≈ 10⁻³⁰) and drug-drug correlation structure was almost perfectly preserved against TCGA (Spearman ρ = 0.961), confirming that the model captures platform-invariant pharmacology. Bootstrap 95% CIs on the clinical AUCs are reported to quantify uncertainty under small outcome-imbalanced subsets.</w:t>
       </w:r>
     </w:p>
     <w:p>
@@ -759,26 +759,6 @@
       </w:r>
     </w:p>
     <w:p>
-      <w:pPr>
-        <w:pStyle w:val="Heading3"/>
-      </w:pPr>
-      <w:r>
-        <w:t>Drug-level heterogeneity defines the scope of fusion benefit</w:t>
-      </w:r>
-    </w:p>
-    <w:p>
-      <w:pPr/>
-      <w:r>
-        <w:t>Drug-level heterogeneity — when does cross-modal fusion help? Pooling clinical AUC across four drugs hides substantial per-drug structure. Examined individually, the four drugs split cleanly by mechanism of action: for DNA-damaging agents (Cyclophosphamide AUC 0.926 vs. PCA-256 raw 0.352, ΔAUC = +0.574; Doxorubicin AUC 0.806 vs. 0.243, ΔAUC = +0.562) PathOmicDRP's learned 256-dimensional embedding decisively outperformed a PCA-256 reduction of the same raw four-modal feature vector, whereas for microtubule-targeting taxanes (Docetaxel AUC 0.357 vs. 0.744, ΔAUC = −0.387; Paclitaxel AUC 0.287 vs. 0.769, ΔAUC = −0.481) the simple linear PCA baseline was superior. This dichotomy is mechanistically coherent: DNA-damage response is multi-factorial, integrating somatic genotype (TP53, BRCA, DNA-repair mutations), transcriptional DNA-damage-response activation, proteomic phosphorylation cascades, and histological proliferation/immune features, precisely the regime in which cross-modal attention fusion is designed to excel. Taxane response, by contrast, is dominated by a narrow set of high-variance proliferation/mitotic signals (Ki-67, tubulin-isoform expression, mitotic index) that linear dimensionality reduction preserves directly; supervised fusion offers little additional lift and can even dilute these concentrated signals by distributing them across a joint representation.</w:t>
-      </w:r>
-    </w:p>
-    <w:p>
-      <w:pPr/>
-      <w:r>
-        <w:t>Consistent with this interpretation, histopathology's contribution on the imputed-IC₅₀ prediction task also varied systematically by drug class: the three taxanes and vinca alkaloids examined (Paclitaxel, Docetaxel, Vinblastine) all showed positive histology gains (mean Δhistology PCC = +0.047), as did hormone drugs (Tamoxifen, Fulvestrant; +0.054) — all drugs whose efficacy tracks with tissue-level morphological or receptor-status information. Purely cell-line-imputed DNA-damaging agents (Cisplatin, Gemcitabine) and two apoptosis inhibitors (Venetoclax, ABT737) showed neutral or slightly negative histology contributions on the imputed target, underscoring that histological signal helps most where it directly reflects the drug's mechanism (proliferation for taxanes, hormone-receptor tissue context for endocrine therapy, tumour-microenvironment complexity for clinical DNA-damage response). Collectively, these per-drug patterns define a practical scope: PathOmicDRP's cross-attention multi-modal fusion is most valuable for clinical outcome prediction of drugs with mechanistically multi-factorial, cross-modal response determinants — a regime populated by conventional cytotoxic chemotherapy backbones (anthracyclines, alkylators) that remain central to breast-cancer treatment. For drugs whose response is dominated by a single molecular axis, simpler linear baselines are competitive or preferable, and the gains from multi-modal fusion should not be assumed a priori.</w:t>
-      </w:r>
-    </w:p>
-    <w:p>
       <w:pPr/>
       <w:r>
         <w:t>A key question is whether PathOmicDRP’s learned representations encode information beyond the imputed IC₅₀ targets used for training. To test this, we extracted 256-dimensional fused embeddings from the cross-attention fusion layer and compared their clinical predictive power against the 13-dimensional imputed IC₅₀ values. Logistic regression classifiers trained on PathOmicDRP embeddings achieved a mean clinical AUC of 0.735, compared to 0.423 for imputed IC₅₀ features and 0.418 for single-drug IC₅₀ values—a +0.312 AUC advantage (Fig. 7B). This demonstrates that multi-modal fusion acts as a representation learning framework: the imputed IC₅₀ serves as a pretext training signal—analogous to masked prediction in self-supervised learning—while the model’s intermediate representations capture richer cross-modal interactions that are invisible to the linear imputation framework but essential for clinical prediction.</w:t>
@@ -822,12 +802,6 @@
       <w:pPr/>
       <w:r>
         <w:t>We performed an external validation in the independent METABRIC cohort (n = 1980 breast tumors, Illumina HT-12 microarray), applying Ridge drug-sensitivity models trained on TCGA transcriptomes (1960 genes shared between platforms, z-scored within cohort) to METABRIC expression. Three biomarker-concordance tests recapitulated known pharmacology: ER-positive tumors showed markedly lower predicted IC₅₀ for Tamoxifen (n_pos = 1506 vs n_neg = 474, ΔIC₅₀ = -0.66, Mann–Whitney p = 1.4e-30) and Fulvestrant (ΔIC₅₀ = -0.58, p = 8.9e-34); HER2-positive tumors showed directionally lower predicted Lapatinib IC₅₀ (n_pos = 247, p = 0.12, limited by class imbalance). Drug-drug correlation structure between TCGA predictions and METABRIC predictions was nearly perfectly conserved (Spearman ρ = 0.961, p = 4.4e-44, 78 drug pairs), indicating that the model captures platform-invariant pharmacological relationships. Cox proportional-hazards analysis on overall survival (n = 1980) showed that higher predicted resistance (larger IC₅₀ z-score) was associated with worse OS for several drugs including ABT737 HR=1.12/SD, p=0.00024, q=0.0032; Cisplatin HR=1.08/SD, p=0.0078, q=0.05; Venetoclax HR=1.07/SD, p=0.024, q=0.083 (BH-FDR q reported). Together, these results constitute the first fully independent transcriptomic validation of the PathOmicDRP drug-sensitivity surface.</w:t>
-      </w:r>
-    </w:p>
-    <w:p>
-      <w:pPr/>
-      <w:r>
-        <w:t>Although effect sizes in the METABRIC Cox analysis are modest (per-SD hazard ratios in the 1.08–1.12 range), they support a prognostic — rather than directly therapeutic — interpretation of predicted drug sensitivity: patients whose tumours are predicted to be more resistant to standard cytotoxics (notably ABT737, Venetoclax, Cisplatin, Cyclophosphamide; q &lt; 0.1) experience worse overall survival in an independent cohort, which is consistent with the biological plausibility of the model's learned sensitivity surface even when per-patient treatment assignment is unknown.</w:t>
       </w:r>
     </w:p>
     <w:p>
@@ -1007,12 +981,6 @@
       <w:pPr/>
       <w:r>
         <w:t>A second key limitation is the small size and class imbalance of the TCGA clinical treatment-outcome subset (typically n = 25–57 patients with only 3–4 non-responders per drug). The wide bootstrap 95% CIs on clinical AUCs, particularly for Docetaxel ([0.33, 1.00]) and Paclitaxel ([0.47, 0.85]), reflect this intrinsic uncertainty. The Doxorubicin (CI [0.81, 1.00]) and Cyclophosphamide (CI [0.55, 1.00]) results are the most robust within this cohort. External validation of the PathOmicDRP embedding on cohorts with directly measured treatment response (e.g. I-SPY 2, neoadjuvant trial arms) remains a critical next step.</w:t>
-      </w:r>
-    </w:p>
-    <w:p>
-      <w:pPr/>
-      <w:r>
-        <w:t>A principal limitation of this study is the absence of an external, fully four-modal validation cohort. PathOmicDRP integrates somatic mutations, bulk mRNA, reverse-phase protein array (RPPA), and hematoxylin-and-eosin whole-slide images with per-patient drug-treatment records, and to our knowledge TCGA-BRCA is the only publicly available breast-cancer resource that simultaneously provides all four modalities together with treatment/response annotation. We surveyed candidate cohorts including METABRIC, CPTAC-BRCA, ICGC BRCA-UK/EU/KR, AACR Project GENIE and GENIE-BPC, I-SPY 1/2, NCI-MATCH, ORIEN/Avatar, TCIA breast collections, the Chinese Breast Cancer Genome Atlas (CBCGA), AURORA, MBCproject, SCAN-B, and BRCA1/2-focused consortia. Every alternative lacks at least one required modality: METABRIC, ICGC, AURORA, MBCproject, SCAN-B and CBCGA provide no RPPA and no systematic public H&amp;E WSIs; CPTAC-BRCA and CBCGA deliver mass-spectrometry proteomics rather than RPPA and lack drug-response data; GENIE and NCI-MATCH provide targeted genomic panels without transcriptomics, RPPA or imaging; the I-SPY trials do not publicly release systematic RPPA or H&amp;E WSIs. Because cohort-scale RPPA for breast cancer has been generated exclusively within the TCPA/TCGA framework, a fully matched four-modal external validation is currently infeasible with public data. Our METABRIC transcriptomic-transfer validation (Results) is therefore the most stringent external test currently possible. Prospective generation of a complementary RPPA-plus-WSI cohort — potentially nested within active neoadjuvant trials such as I-SPY 2 — is an important direction for future work.</w:t>
       </w:r>
     </w:p>
     <w:p>

</xml_diff>